<commit_message>
TZ document v2.0: bilingual (RU+EN), covers parts/early finish/workbook length/mobile app
- tools/docgen/generate_tz.js now builds both languages in one run
- Updated: new features (left windows, test lengths, game parts, early
  finish, training notes), mobile shells, current test counts (53+88),
  extended glossary and backlog
</commit_message>
<xml_diff>
--- a/ТЗ_Quizzical_Club.docx
+++ b/ТЗ_Quizzical_Club.docx
@@ -49,7 +49,7 @@
           <w:sz w:val="24"/>
           <w:szCs w:val="24"/>
         </w:rPr>
-        <w:t xml:space="preserve">Командная игра-викторина + тренажёр для олимпиадной подготовки</w:t>
+        <w:t xml:space="preserve">Командная игра-викторина + тренажёр для олимпиадной подготовки · веб, Android, iOS</w:t>
       </w:r>
     </w:p>
     <w:p>
@@ -178,7 +178,7 @@
                 <w:b w:val="false"/>
                 <w:bCs w:val="false"/>
               </w:rPr>
-              <w:t xml:space="preserve">1.0 (шаблон для развития)</w:t>
+              <w:t xml:space="preserve">2.0 (шаблон для развития)</w:t>
             </w:r>
           </w:p>
         </w:tc>
@@ -232,7 +232,7 @@
                 <w:b w:val="false"/>
                 <w:bCs w:val="false"/>
               </w:rPr>
-              <w:t xml:space="preserve">11 октября 2026</w:t>
+              <w:t xml:space="preserve">14 октября 2026</w:t>
             </w:r>
           </w:p>
         </w:tc>
@@ -368,7 +368,7 @@
                 <w:b w:val="false"/>
                 <w:bCs w:val="false"/>
               </w:rPr>
-              <w:t xml:space="preserve">Статус</w:t>
+              <w:t xml:space="preserve">Мобильные оболочки</w:t>
             </w:r>
           </w:p>
         </w:tc>
@@ -394,7 +394,7 @@
                 <w:b w:val="false"/>
                 <w:bCs w:val="false"/>
               </w:rPr>
-              <w:t xml:space="preserve">В эксплуатации, активная разработка</w:t>
+              <w:t xml:space="preserve">Capacitor 8: android/ + ios/ (appId com.quizzicalclub.app)</w:t>
             </w:r>
           </w:p>
         </w:tc>
@@ -422,6 +422,60 @@
                 <w:b w:val="false"/>
                 <w:bCs w:val="false"/>
               </w:rPr>
+              <w:t xml:space="preserve">Статус</w:t>
+            </w:r>
+          </w:p>
+        </w:tc>
+        <w:tc>
+          <w:tcPr>
+            <w:tcW w:type="dxa" w:w="6226"/>
+            <w:tcBorders>
+              <w:top w:val="single" w:color="C9CFC9" w:sz="1"/>
+              <w:left w:val="single" w:color="C9CFC9" w:sz="1"/>
+              <w:bottom w:val="single" w:color="C9CFC9" w:sz="1"/>
+              <w:right w:val="single" w:color="C9CFC9" w:sz="1"/>
+            </w:tcBorders>
+            <w:tcMar>
+              <w:top w:type="dxa" w:w="80"/>
+              <w:left w:type="dxa" w:w="120"/>
+              <w:bottom w:type="dxa" w:w="80"/>
+              <w:right w:type="dxa" w:w="120"/>
+            </w:tcMar>
+          </w:tcPr>
+          <w:p>
+            <w:r>
+              <w:rPr>
+                <w:b w:val="false"/>
+                <w:bCs w:val="false"/>
+              </w:rPr>
+              <w:t xml:space="preserve">В эксплуатации, активная разработка</w:t>
+            </w:r>
+          </w:p>
+        </w:tc>
+      </w:tr>
+      <w:tr>
+        <w:tc>
+          <w:tcPr>
+            <w:tcW w:type="dxa" w:w="2800"/>
+            <w:tcBorders>
+              <w:top w:val="single" w:color="C9CFC9" w:sz="1"/>
+              <w:left w:val="single" w:color="C9CFC9" w:sz="1"/>
+              <w:bottom w:val="single" w:color="C9CFC9" w:sz="1"/>
+              <w:right w:val="single" w:color="C9CFC9" w:sz="1"/>
+            </w:tcBorders>
+            <w:tcMar>
+              <w:top w:type="dxa" w:w="80"/>
+              <w:left w:type="dxa" w:w="120"/>
+              <w:bottom w:type="dxa" w:w="80"/>
+              <w:right w:type="dxa" w:w="120"/>
+            </w:tcMar>
+          </w:tcPr>
+          <w:p>
+            <w:r>
+              <w:rPr>
+                <w:b w:val="false"/>
+                <w:bCs w:val="false"/>
+              </w:rPr>
               <w:t xml:space="preserve">Стек</w:t>
             </w:r>
           </w:p>
@@ -448,7 +502,7 @@
                 <w:b w:val="false"/>
                 <w:bCs w:val="false"/>
               </w:rPr>
-              <w:t xml:space="preserve">Vite 8 · React 19 · TypeScript (strict) · Tailwind 4 · Zustand · Zod · Motion · Vitest · Playwright</w:t>
+              <w:t xml:space="preserve">Vite 8 · React 19 · TS strict · Tailwind 4 · Zustand · Zod · Motion · Vitest · Playwright · Capacitor 8</w:t>
             </w:r>
           </w:p>
         </w:tc>
@@ -524,7 +578,7 @@
           </w:pPr>
           <w:hyperlink w:history="1" w:anchor="_Toc3">
             <w:r>
-              <w:t xml:space="preserve">1.2. Ключевые факты о текущей версии</w:t>
+              <w:t xml:space="preserve">1.2. Ключевые факты</w:t>
             </w:r>
             <w:r>
               <w:tab/>
@@ -653,37 +707,37 @@
         </w:p>
         <w:p>
           <w:pPr>
-            <w:pStyle w:val="TOC1"/>
-            <w:tabs>
-              <w:tab w:val="right" w:pos="9026" w:leader="dot"/>
-            </w:tabs>
-          </w:pPr>
-          <w:hyperlink w:history="1" w:anchor="_Toc9">
-            <w:r>
-              <w:t xml:space="preserve">3. Архитектура</w:t>
-            </w:r>
-            <w:r>
-              <w:tab/>
-            </w:r>
-            <w:r>
-              <w:fldChar w:fldCharType="begin" w:dirty="true"/>
-              <w:instrText xml:space="preserve">PAGEREF _Toc9 \h</w:instrText>
-              <w:fldChar w:fldCharType="separate"/>
-              <w:fldChar w:fldCharType="end"/>
-            </w:r>
-          </w:hyperlink>
-        </w:p>
-        <w:p>
-          <w:pPr>
             <w:pStyle w:val="TOC2"/>
             <w:tabs>
               <w:tab w:val="right" w:pos="9026" w:leader="dot"/>
             </w:tabs>
             <w:ind w:left="220"/>
           </w:pPr>
+          <w:hyperlink w:history="1" w:anchor="_Toc9">
+            <w:r>
+              <w:t xml:space="preserve">2.5. Мобильное приложение</w:t>
+            </w:r>
+            <w:r>
+              <w:tab/>
+            </w:r>
+            <w:r>
+              <w:fldChar w:fldCharType="begin" w:dirty="true"/>
+              <w:instrText xml:space="preserve">PAGEREF _Toc9 \h</w:instrText>
+              <w:fldChar w:fldCharType="separate"/>
+              <w:fldChar w:fldCharType="end"/>
+            </w:r>
+          </w:hyperlink>
+        </w:p>
+        <w:p>
+          <w:pPr>
+            <w:pStyle w:val="TOC1"/>
+            <w:tabs>
+              <w:tab w:val="right" w:pos="9026" w:leader="dot"/>
+            </w:tabs>
+          </w:pPr>
           <w:hyperlink w:history="1" w:anchor="_Toc10">
             <w:r>
-              <w:t xml:space="preserve">3.1. Принципы</w:t>
+              <w:t xml:space="preserve">3. Архитектура</w:t>
             </w:r>
             <w:r>
               <w:tab/>
@@ -706,7 +760,7 @@
           </w:pPr>
           <w:hyperlink w:history="1" w:anchor="_Toc11">
             <w:r>
-              <w:t xml:space="preserve">3.2. Структура репозитория</w:t>
+              <w:t xml:space="preserve">3.1. Принципы</w:t>
             </w:r>
             <w:r>
               <w:tab/>
@@ -729,7 +783,7 @@
           </w:pPr>
           <w:hyperlink w:history="1" w:anchor="_Toc12">
             <w:r>
-              <w:t xml:space="preserve">3.3. Жизненный цикл командной игры</w:t>
+              <w:t xml:space="preserve">3.2. Структура репозитория</w:t>
             </w:r>
             <w:r>
               <w:tab/>
@@ -737,28 +791,6 @@
             <w:r>
               <w:fldChar w:fldCharType="begin" w:dirty="true"/>
               <w:instrText xml:space="preserve">PAGEREF _Toc12 \h</w:instrText>
-              <w:fldChar w:fldCharType="separate"/>
-              <w:fldChar w:fldCharType="end"/>
-            </w:r>
-          </w:hyperlink>
-        </w:p>
-        <w:p>
-          <w:pPr>
-            <w:pStyle w:val="TOC1"/>
-            <w:tabs>
-              <w:tab w:val="right" w:pos="9026" w:leader="dot"/>
-            </w:tabs>
-          </w:pPr>
-          <w:hyperlink w:history="1" w:anchor="_Toc13">
-            <w:r>
-              <w:t xml:space="preserve">4. Тестирование и качество</w:t>
-            </w:r>
-            <w:r>
-              <w:tab/>
-            </w:r>
-            <w:r>
-              <w:fldChar w:fldCharType="begin" w:dirty="true"/>
-              <w:instrText xml:space="preserve">PAGEREF _Toc13 \h</w:instrText>
               <w:fldChar w:fldCharType="separate"/>
               <w:fldChar w:fldCharType="end"/>
             </w:r>
@@ -772,16 +804,16 @@
             </w:tabs>
             <w:ind w:left="220"/>
           </w:pPr>
-          <w:hyperlink w:history="1" w:anchor="_Toc14">
-            <w:r>
-              <w:t xml:space="preserve">4.1. CI/CD</w:t>
+          <w:hyperlink w:history="1" w:anchor="_Toc13">
+            <w:r>
+              <w:t xml:space="preserve">3.3. Жизненный цикл командной игры</w:t>
             </w:r>
             <w:r>
               <w:tab/>
             </w:r>
             <w:r>
               <w:fldChar w:fldCharType="begin" w:dirty="true"/>
-              <w:instrText xml:space="preserve">PAGEREF _Toc14 \h</w:instrText>
+              <w:instrText xml:space="preserve">PAGEREF _Toc13 \h</w:instrText>
               <w:fldChar w:fldCharType="separate"/>
               <w:fldChar w:fldCharType="end"/>
             </w:r>
@@ -794,16 +826,16 @@
               <w:tab w:val="right" w:pos="9026" w:leader="dot"/>
             </w:tabs>
           </w:pPr>
-          <w:hyperlink w:history="1" w:anchor="_Toc15">
-            <w:r>
-              <w:t xml:space="preserve">5. Как добавлять фичи (руководство разработчика)</w:t>
+          <w:hyperlink w:history="1" w:anchor="_Toc14">
+            <w:r>
+              <w:t xml:space="preserve">4. Тестирование и качество</w:t>
             </w:r>
             <w:r>
               <w:tab/>
             </w:r>
             <w:r>
               <w:fldChar w:fldCharType="begin" w:dirty="true"/>
-              <w:instrText xml:space="preserve">PAGEREF _Toc15 \h</w:instrText>
+              <w:instrText xml:space="preserve">PAGEREF _Toc14 \h</w:instrText>
               <w:fldChar w:fldCharType="separate"/>
               <w:fldChar w:fldCharType="end"/>
             </w:r>
@@ -817,9 +849,31 @@
             </w:tabs>
             <w:ind w:left="220"/>
           </w:pPr>
+          <w:hyperlink w:history="1" w:anchor="_Toc15">
+            <w:r>
+              <w:t xml:space="preserve">4.1. CI/CD</w:t>
+            </w:r>
+            <w:r>
+              <w:tab/>
+            </w:r>
+            <w:r>
+              <w:fldChar w:fldCharType="begin" w:dirty="true"/>
+              <w:instrText xml:space="preserve">PAGEREF _Toc15 \h</w:instrText>
+              <w:fldChar w:fldCharType="separate"/>
+              <w:fldChar w:fldCharType="end"/>
+            </w:r>
+          </w:hyperlink>
+        </w:p>
+        <w:p>
+          <w:pPr>
+            <w:pStyle w:val="TOC1"/>
+            <w:tabs>
+              <w:tab w:val="right" w:pos="9026" w:leader="dot"/>
+            </w:tabs>
+          </w:pPr>
           <w:hyperlink w:history="1" w:anchor="_Toc16">
             <w:r>
-              <w:t xml:space="preserve">5.1. Новая игра из существующих досок</w:t>
+              <w:t xml:space="preserve">5. Как добавлять фичи (руководство разработчика)</w:t>
             </w:r>
             <w:r>
               <w:tab/>
@@ -842,7 +896,7 @@
           </w:pPr>
           <w:hyperlink w:history="1" w:anchor="_Toc17">
             <w:r>
-              <w:t xml:space="preserve">5.2. Новый контент (доска/категории)</w:t>
+              <w:t xml:space="preserve">5.1. Новая игра из существующих досок</w:t>
             </w:r>
             <w:r>
               <w:tab/>
@@ -865,7 +919,7 @@
           </w:pPr>
           <w:hyperlink w:history="1" w:anchor="_Toc18">
             <w:r>
-              <w:t xml:space="preserve">5.3. Новый тип задания для воркбука</w:t>
+              <w:t xml:space="preserve">5.2. Новый контент (доска/категории)</w:t>
             </w:r>
             <w:r>
               <w:tab/>
@@ -888,7 +942,7 @@
           </w:pPr>
           <w:hyperlink w:history="1" w:anchor="_Toc19">
             <w:r>
-              <w:t xml:space="preserve">5.4. Новая фича в игровом движке</w:t>
+              <w:t xml:space="preserve">5.3. Новый тип задания для воркбука</w:t>
             </w:r>
             <w:r>
               <w:tab/>
@@ -911,7 +965,7 @@
           </w:pPr>
           <w:hyperlink w:history="1" w:anchor="_Toc20">
             <w:r>
-              <w:t xml:space="preserve">5.5. Правила оформления кода</w:t>
+              <w:t xml:space="preserve">5.4. Новая механика движка</w:t>
             </w:r>
             <w:r>
               <w:tab/>
@@ -926,14 +980,15 @@
         </w:p>
         <w:p>
           <w:pPr>
-            <w:pStyle w:val="TOC1"/>
+            <w:pStyle w:val="TOC2"/>
             <w:tabs>
               <w:tab w:val="right" w:pos="9026" w:leader="dot"/>
             </w:tabs>
+            <w:ind w:left="220"/>
           </w:pPr>
           <w:hyperlink w:history="1" w:anchor="_Toc21">
             <w:r>
-              <w:t xml:space="preserve">6. Шаблон постановки будущей фичи</w:t>
+              <w:t xml:space="preserve">5.5. Правила кода</w:t>
             </w:r>
             <w:r>
               <w:tab/>
@@ -955,7 +1010,7 @@
           </w:pPr>
           <w:hyperlink w:history="1" w:anchor="_Toc22">
             <w:r>
-              <w:t xml:space="preserve">7. Открытые направления (бэклог-идеи)</w:t>
+              <w:t xml:space="preserve">6. Шаблон постановки будущей фичи</w:t>
             </w:r>
             <w:r>
               <w:tab/>
@@ -977,7 +1032,7 @@
           </w:pPr>
           <w:hyperlink w:history="1" w:anchor="_Toc23">
             <w:r>
-              <w:t xml:space="preserve">8. Глоссарий</w:t>
+              <w:t xml:space="preserve">7. Открытые направления (бэклог)</w:t>
             </w:r>
             <w:r>
               <w:tab/>
@@ -985,6 +1040,28 @@
             <w:r>
               <w:fldChar w:fldCharType="begin" w:dirty="true"/>
               <w:instrText xml:space="preserve">PAGEREF _Toc23 \h</w:instrText>
+              <w:fldChar w:fldCharType="separate"/>
+              <w:fldChar w:fldCharType="end"/>
+            </w:r>
+          </w:hyperlink>
+        </w:p>
+        <w:p>
+          <w:pPr>
+            <w:pStyle w:val="TOC1"/>
+            <w:tabs>
+              <w:tab w:val="right" w:pos="9026" w:leader="dot"/>
+            </w:tabs>
+          </w:pPr>
+          <w:hyperlink w:history="1" w:anchor="_Toc24">
+            <w:r>
+              <w:t xml:space="preserve">8. Глоссарий</w:t>
+            </w:r>
+            <w:r>
+              <w:tab/>
+            </w:r>
+            <w:r>
+              <w:fldChar w:fldCharType="begin" w:dirty="true"/>
+              <w:instrText xml:space="preserve">PAGEREF _Toc24 \h</w:instrText>
               <w:fldChar w:fldCharType="separate"/>
               <w:fldChar w:fldCharType="end"/>
             </w:r>
@@ -1017,7 +1094,7 @@
         <w:spacing w:after="120"/>
       </w:pPr>
       <w:r>
-        <w:t xml:space="preserve">Quizzical Club — браузерная игра-викторина в формате Jeopardy для семейных и учебных сессий. Сайт полностью статический, работает на GitHub Pages, не требует сервера, аккаунтов и интернет-зависимостей после первой загрузки.</w:t>
+        <w:t xml:space="preserve">Quizzical Club — игра-викторина в формате Jeopardy для семейных и учебных сессий. Одна кодовая база работает как сайт (GitHub Pages) и как мобильное приложение (Capacitor-оболочки Android/iOS). Без сервера и аккаунтов; все сейвы — локально на устройстве.</w:t>
       </w:r>
     </w:p>
     <w:p>
@@ -1025,7 +1102,7 @@
         <w:spacing w:after="120"/>
       </w:pPr>
       <w:r>
-        <w:t xml:space="preserve">Проект вырос из книжного контента (сборники головоломок и викторин) и серии игр «Use of English Jeopardy». Основная аудитория — семья и ученики, готовящиеся к олимпиадам по английскому языку (идиомы, словесные игры, пословицы).</w:t>
+        <w:t xml:space="preserve">Проект вырос из книжного контента (сборники головоломок и викторин) и серии игр «Use of English Jeopardy». Аудитория — семья и ученики, готовящиеся к олимпиадам по английскому языку.</w:t>
       </w:r>
     </w:p>
     <w:p>
@@ -1061,7 +1138,7 @@
         <w:spacing w:after="60"/>
       </w:pPr>
       <w:r>
-        <w:t xml:space="preserve">Соло-тренировка по типам заданий с проверкой ответов и историей лучших результатов.</w:t>
+        <w:t xml:space="preserve">Соло-тренировка по типам заданий с нечёткой проверкой ответов и рекордами.</w:t>
       </w:r>
     </w:p>
     <w:p>
@@ -1087,7 +1164,20 @@
         <w:spacing w:after="60"/>
       </w:pPr>
       <w:r>
-        <w:t xml:space="preserve">Статистика трудных категорий для планирования подготовки к олимпиадам.</w:t>
+        <w:t xml:space="preserve">Статистика трудных категорий (Training notes) для подготовки к олимпиадам.</w:t>
+      </w:r>
+    </w:p>
+    <w:p>
+      <w:pPr>
+        <w:pStyle w:val="ListParagraph"/>
+        <w:numPr>
+          <w:ilvl w:val="0"/>
+          <w:numId w:val="2"/>
+        </w:numPr>
+        <w:spacing w:after="60"/>
+      </w:pPr>
+      <w:r>
+        <w:t xml:space="preserve">Короткие сессии: длинные игры разбиты на части ≤ 3 досок, возможен досрочный выход к итогам.</w:t>
       </w:r>
     </w:p>
     <w:p>
@@ -1096,7 +1186,7 @@
       </w:pPr>
       <w:bookmarkStart w:name="_Toc3" w:id="3"/>
       <w:r>
-        <w:t xml:space="preserve">1.2. Ключевые факты о текущей версии</w:t>
+        <w:t xml:space="preserve">1.2. Ключевые факты</w:t>
       </w:r>
       <w:bookmarkEnd w:id="3"/>
     </w:p>
@@ -1195,7 +1285,7 @@
                 <w:b w:val="false"/>
                 <w:bCs w:val="false"/>
               </w:rPr>
-              <w:t xml:space="preserve">Игр на выбор</w:t>
+              <w:t xml:space="preserve">Игр (источники)</w:t>
             </w:r>
           </w:p>
         </w:tc>
@@ -1221,7 +1311,7 @@
                 <w:b w:val="false"/>
                 <w:bCs w:val="false"/>
               </w:rPr>
-              <w:t xml:space="preserve">17 (4 арены + микс + 5 книжных сетов + 7 классических)</w:t>
+              <w:t xml:space="preserve">17 — арены I–IV, Arena Mix, 5 книжных сетов, 7 классических</w:t>
             </w:r>
           </w:p>
         </w:tc>
@@ -1249,7 +1339,7 @@
                 <w:b w:val="false"/>
                 <w:bCs w:val="false"/>
               </w:rPr>
-              <w:t xml:space="preserve">Вопросов в хранилище</w:t>
+              <w:t xml:space="preserve">Игр на экране выбора</w:t>
             </w:r>
           </w:p>
         </w:tc>
@@ -1275,7 +1365,7 @@
                 <w:b w:val="false"/>
                 <w:bCs w:val="false"/>
               </w:rPr>
-              <w:t xml:space="preserve">≈ 1 690 (540 книжных + 275 UoE + 870 классических, с пересечениями)</w:t>
+              <w:t xml:space="preserve">26 частей (длинные игры разбиты по ≤ 3 доски)</w:t>
             </w:r>
           </w:p>
         </w:tc>
@@ -1303,7 +1393,7 @@
                 <w:b w:val="false"/>
                 <w:bCs w:val="false"/>
               </w:rPr>
-              <w:t xml:space="preserve">Досок в игре</w:t>
+              <w:t xml:space="preserve">Вопросов в хранилище</w:t>
             </w:r>
           </w:p>
         </w:tc>
@@ -1329,7 +1419,7 @@
                 <w:b w:val="false"/>
                 <w:bCs w:val="false"/>
               </w:rPr>
-              <w:t xml:space="preserve">от 2 до 14 (Гранд-Марафон)</w:t>
+              <w:t xml:space="preserve">≈ 1 690 (540 книжных + 275 UoE + 870 классических)</w:t>
             </w:r>
           </w:p>
         </w:tc>
@@ -1383,7 +1473,7 @@
                 <w:b w:val="false"/>
                 <w:bCs w:val="false"/>
               </w:rPr>
-              <w:t xml:space="preserve">47 юнит (vitest) + 56 e2e (playwright)</w:t>
+              <w:t xml:space="preserve">53 юнит (vitest) + 88 e2e (playwright, десктоп + мобильный)</w:t>
             </w:r>
           </w:p>
         </w:tc>
@@ -1411,7 +1501,7 @@
                 <w:b w:val="false"/>
                 <w:bCs w:val="false"/>
               </w:rPr>
-              <w:t xml:space="preserve">CI</w:t>
+              <w:t xml:space="preserve">CI/CD</w:t>
             </w:r>
           </w:p>
         </w:tc>
@@ -1437,7 +1527,7 @@
                 <w:b w:val="false"/>
                 <w:bCs w:val="false"/>
               </w:rPr>
-              <w:t xml:space="preserve">GitHub Actions: typecheck → юнит → e2e-гейт → деплой на Pages</w:t>
+              <w:t xml:space="preserve">Pages-деплой с e2e-гейтом · Android APK+AAB · iOS build check (macOS)</w:t>
             </w:r>
           </w:p>
         </w:tc>
@@ -1478,7 +1568,7 @@
         <w:spacing w:after="60"/>
       </w:pPr>
       <w:r>
-        <w:t xml:space="preserve">Экран выбора игры списком, сгруппированный по сериям: Idiom Arenas / Book Club / Classic Vault. На карточке — уровень сложности, число досок и точное число вопросов.</w:t>
+        <w:t xml:space="preserve">Экран выбора игры списком по сериям (Idiom Arenas / Book Club / Classic Vault); длинные игры показаны частями «Часть N из M» с точным числом досок и вопросов.</w:t>
       </w:r>
     </w:p>
     <w:p>
@@ -1491,7 +1581,7 @@
         <w:spacing w:after="60"/>
       </w:pPr>
       <w:r>
-        <w:t xml:space="preserve">Настройка команд: 1–4 команды, имена запоминаются между сессиями; переключатель «Final wager round» (финальная ставка) с дефолтом по типу игры и сохранением выбора.</w:t>
+        <w:t xml:space="preserve">Настройка команд: 1–4 команды, имена запоминаются; переключатель «Final wager round» с дефолтом по игре и сохранением выбора.</w:t>
       </w:r>
     </w:p>
     <w:p>
@@ -1504,7 +1594,7 @@
         <w:spacing w:after="60"/>
       </w:pPr>
       <w:r>
-        <w:t xml:space="preserve">Доска 5×5 (поддерживаются и 4-колоночные раунды классики): значения растут с номером раунда (100–500 × N).</w:t>
+        <w:t xml:space="preserve">Доска 5×5 (поддерживаются 4-колоночные раунды классики); ценности растут по номеру раунда внутри части (100–500 × 1–3).</w:t>
       </w:r>
     </w:p>
     <w:p>
@@ -1517,7 +1607,7 @@
         <w:spacing w:after="60"/>
       </w:pPr>
       <w:r>
-        <w:t xml:space="preserve">Ведущий открывает плитку → читает вопрос → Reveal → начисляет очки команде или «Nobody». Заметки для ведущего показываются под ответом у классических вопросов.</w:t>
+        <w:t xml:space="preserve">Окна активности (вопрос, ставка) на десктопе прижаты к левому краю (≤ 46% ширины) — доска и табло остаются видны; на мобильном — во всю ширину.</w:t>
       </w:r>
     </w:p>
     <w:p>
@@ -1530,7 +1620,7 @@
         <w:spacing w:after="60"/>
       </w:pPr>
       <w:r>
-        <w:t xml:space="preserve">Активная команда подсвечена и пульсирует; очки анимируются; звуковые эффекты синтезируются через Web Audio (без файлов), есть отключение звука и reduced-motion.</w:t>
+        <w:t xml:space="preserve">Ведущий: плитка → вопрос → Reveal → очки команде или «Nobody». У классических вопросов под ответом есть заметки для ведущего.</w:t>
       </w:r>
     </w:p>
     <w:p>
@@ -1543,7 +1633,7 @@
         <w:spacing w:after="60"/>
       </w:pPr>
       <w:r>
-        <w:t xml:space="preserve">Финал со ставками (для книжных сетов и по переключателю для остальных): каждая команда ставит до своей суммы, ведущий отмечает верно/неверно по каждой.</w:t>
+        <w:t xml:space="preserve">Кнопка «Завершить игру» на доске (неактивна, пока открыт вопрос) → подтверждение: «К финалу» / «Сразу к итогам» / «Отмена»; на экране победителя — пометка «Завершено досрочно», нераскрытые плитки не считаются промахами.</w:t>
       </w:r>
     </w:p>
     <w:p>
@@ -1556,7 +1646,20 @@
         <w:spacing w:after="60"/>
       </w:pPr>
       <w:r>
-        <w:t xml:space="preserve">Экран победителя: турнирная таблица, блок «Training notes» — самые трудные категории этой игры и all-time drill list.</w:t>
+        <w:t xml:space="preserve">Финал со ставками; экран победителя с турнирной таблицей и «Training notes»: трудные категории игры + all-time drill list.</w:t>
+      </w:r>
+    </w:p>
+    <w:p>
+      <w:pPr>
+        <w:pStyle w:val="ListParagraph"/>
+        <w:numPr>
+          <w:ilvl w:val="0"/>
+          <w:numId w:val="2"/>
+        </w:numPr>
+        <w:spacing w:after="60"/>
+      </w:pPr>
+      <w:r>
+        <w:t xml:space="preserve">Звук синтезируется Web Audio (без файлов), отключается; поддерживается reduced motion.</w:t>
       </w:r>
     </w:p>
     <w:p>
@@ -1579,7 +1682,7 @@
         <w:spacing w:after="60"/>
       </w:pPr>
       <w:r>
-        <w:t xml:space="preserve">10 типов заданий + «Everything»: Homonyms, Compound Words, Word Parts, Backwords, Heteronyms, Letter Trivia, Initials, Hidden Words, Title Swap, Geography, General Knowledge.</w:t>
+        <w:t xml:space="preserve">10 типов заданий + «Everything»; фильтр сложности Easy / Medium / Hard.</w:t>
       </w:r>
     </w:p>
     <w:p>
@@ -1592,7 +1695,7 @@
         <w:spacing w:after="60"/>
       </w:pPr>
       <w:r>
-        <w:t xml:space="preserve">Фильтр сложности (Easy / Medium / Hard), тест из 10 вопросов, нечёткая проверка ответов (опечатки, артикли, варианты через «/»).</w:t>
+        <w:t xml:space="preserve">Выбор длины теста: 5 / 10 / 20 вопросов (по умолчанию 10), запоминается; если пул меньше — вариант неактивен с подсказкой.</w:t>
       </w:r>
     </w:p>
     <w:p>
@@ -1605,7 +1708,7 @@
         <w:spacing w:after="60"/>
       </w:pPr>
       <w:r>
-        <w:t xml:space="preserve">Экран результатов с разбором ошибок; лучший результат по каждой паре «тип × уровень» хранится локально.</w:t>
+        <w:t xml:space="preserve">Нечёткая проверка ответов (опечатки, артикли, варианты через «/»); результаты «X из N» + процент; рекорды по ключу «тип × уровень × длина», старые рекорды мигрируют как N=10.</w:t>
       </w:r>
     </w:p>
     <w:p>
@@ -1628,7 +1731,7 @@
         <w:spacing w:after="60"/>
       </w:pPr>
       <w:r>
-        <w:t xml:space="preserve">13 гайдов по типам заданий: правила, разобранный пример, стратегические советы; кнопка «Practice this type» ведёт в тренажёр.</w:t>
+        <w:t xml:space="preserve">13 гайдов: правила, разобранный пример, стратегии; «Practice this type» ведёт в воркбук.</w:t>
       </w:r>
     </w:p>
     <w:p>
@@ -1736,7 +1839,7 @@
                 <w:b/>
                 <w:bCs/>
               </w:rPr>
-              <w:t xml:space="preserve">Источник контента</w:t>
+              <w:t xml:space="preserve">Источник</w:t>
             </w:r>
           </w:p>
         </w:tc>
@@ -1790,7 +1893,7 @@
                 <w:b w:val="false"/>
                 <w:bCs w:val="false"/>
               </w:rPr>
-              <w:t xml:space="preserve">Arena I–IV (5–6 досок), Arena Mix (5 случайных досок из 21)</w:t>
+              <w:t xml:space="preserve">Arena I–IV (по 2 части), Arena Mix (3 случайные доски из 21)</w:t>
             </w:r>
           </w:p>
         </w:tc>
@@ -1816,7 +1919,7 @@
                 <w:b w:val="false"/>
                 <w:bCs w:val="false"/>
               </w:rPr>
-              <w:t xml:space="preserve">Use of English Jeopardy + сборка из классики</w:t>
+              <w:t xml:space="preserve">Use of English Jeopardy + сборки классики</w:t>
             </w:r>
           </w:p>
         </w:tc>
@@ -1870,7 +1973,7 @@
                 <w:b w:val="false"/>
                 <w:bCs w:val="false"/>
               </w:rPr>
-              <w:t xml:space="preserve">First Words, Around the World, Names &amp; Faces, Brain Stretchers, Championship</w:t>
+              <w:t xml:space="preserve">5 сетов (2 доски + финал)</w:t>
             </w:r>
           </w:p>
         </w:tc>
@@ -1950,7 +2053,7 @@
                 <w:b w:val="false"/>
                 <w:bCs w:val="false"/>
               </w:rPr>
-              <w:t xml:space="preserve">Wordplay Classics … Grand Marathon (14 досок, 345 вопросов)</w:t>
+              <w:t xml:space="preserve">7 сетов → части по ≤ 3 доски; Grand Marathon → 5 частей</w:t>
             </w:r>
           </w:p>
         </w:tc>
@@ -1976,7 +2079,7 @@
                 <w:b w:val="false"/>
                 <w:bCs w:val="false"/>
               </w:rPr>
-              <w:t xml:space="preserve">Классические сеты первого сайта (38 досок, 174 категории)</w:t>
+              <w:t xml:space="preserve">Классические сеты (38 досок, 174 категории)</w:t>
             </w:r>
           </w:p>
         </w:tc>
@@ -1995,7 +2098,69 @@
         <w:spacing w:after="120"/>
       </w:pPr>
       <w:r>
-        <w:t xml:space="preserve">Весь контент анонимизирован: названия и авторы исходных книг в приложении не упоминаются (есть регрессионный тест).</w:t>
+        <w:t xml:space="preserve">Весь контент анонимизирован: названия и авторы исходных книг в приложении не упоминаются (регрессионный тест).</w:t>
+      </w:r>
+    </w:p>
+    <w:p>
+      <w:pPr>
+        <w:pStyle w:val="Heading2"/>
+      </w:pPr>
+      <w:bookmarkStart w:name="_Toc9" w:id="9"/>
+      <w:r>
+        <w:t xml:space="preserve">2.5. Мобильное приложение</w:t>
+      </w:r>
+      <w:bookmarkEnd w:id="9"/>
+    </w:p>
+    <w:p>
+      <w:pPr>
+        <w:pStyle w:val="ListParagraph"/>
+        <w:numPr>
+          <w:ilvl w:val="0"/>
+          <w:numId w:val="2"/>
+        </w:numPr>
+        <w:spacing w:after="60"/>
+      </w:pPr>
+      <w:r>
+        <w:t xml:space="preserve">Capacitor 8: нативные проекты android/ и ios/ поверх общей кодовой базы; appId com.quizzicalclub.app (смена задокументирована).</w:t>
+      </w:r>
+    </w:p>
+    <w:p>
+      <w:pPr>
+        <w:pStyle w:val="ListParagraph"/>
+        <w:numPr>
+          <w:ilvl w:val="0"/>
+          <w:numId w:val="2"/>
+        </w:numPr>
+        <w:spacing w:after="60"/>
+      </w:pPr>
+      <w:r>
+        <w:t xml:space="preserve">Брендовые иконки (шалфейная плитка Q) сгенерированы для обеих платформ; safe-area отступы для чёлок.</w:t>
+      </w:r>
+    </w:p>
+    <w:p>
+      <w:pPr>
+        <w:pStyle w:val="ListParagraph"/>
+        <w:numPr>
+          <w:ilvl w:val="0"/>
+          <w:numId w:val="2"/>
+        </w:numPr>
+        <w:spacing w:after="60"/>
+      </w:pPr>
+      <w:r>
+        <w:t xml:space="preserve">CI: android.yml собирает debug APK + release AAB артефактами; ios.yml проверяет сборку на macOS (unsigned).</w:t>
+      </w:r>
+    </w:p>
+    <w:p>
+      <w:pPr>
+        <w:pStyle w:val="ListParagraph"/>
+        <w:numPr>
+          <w:ilvl w:val="0"/>
+          <w:numId w:val="2"/>
+        </w:numPr>
+        <w:spacing w:after="60"/>
+      </w:pPr>
+      <w:r>
+        <w:t xml:space="preserve">Гайд по сторам и монетизации: docs/STORE_GUIDE.md (подпись, Data safety = no data collected, рейтинг, варианты монетизации).</w:t>
       </w:r>
     </w:p>
     <w:p>
@@ -2007,21 +2172,21 @@
       <w:pPr>
         <w:pStyle w:val="Heading1"/>
       </w:pPr>
-      <w:bookmarkStart w:name="_Toc9" w:id="9"/>
+      <w:bookmarkStart w:name="_Toc10" w:id="10"/>
       <w:r>
         <w:t xml:space="preserve">3. Архитектура</w:t>
       </w:r>
-      <w:bookmarkEnd w:id="9"/>
+      <w:bookmarkEnd w:id="10"/>
     </w:p>
     <w:p>
       <w:pPr>
         <w:pStyle w:val="Heading2"/>
       </w:pPr>
-      <w:bookmarkStart w:name="_Toc10" w:id="10"/>
+      <w:bookmarkStart w:name="_Toc11" w:id="11"/>
       <w:r>
         <w:t xml:space="preserve">3.1. Принципы</w:t>
       </w:r>
-      <w:bookmarkEnd w:id="10"/>
+      <w:bookmarkEnd w:id="11"/>
     </w:p>
     <w:p>
       <w:pPr>
@@ -2033,7 +2198,7 @@
         <w:spacing w:after="60"/>
       </w:pPr>
       <w:r>
-        <w:t xml:space="preserve">Статический SPA: хэш-роутинг (#/sets, #/game, #/workbook, #/guides), base './' — работает на любом подпути GitHub Pages.</w:t>
+        <w:t xml:space="preserve">Статический SPA: хэш-роутинг, base './' — работает на любом подпути Pages и внутри WebView.</w:t>
       </w:r>
     </w:p>
     <w:p>
@@ -2046,7 +2211,7 @@
         <w:spacing w:after="60"/>
       </w:pPr>
       <w:r>
-        <w:t xml:space="preserve">Игровые правила отделены от рендера: вся логика в zustand-сторах и чистых функциях lib/, анимации не могут повредить состояние.</w:t>
+        <w:t xml:space="preserve">Правила отделены от рендера: логика в zustand-сторах и чистых функциях lib/; анимации не могут повредить состояние.</w:t>
       </w:r>
     </w:p>
     <w:p>
@@ -2059,7 +2224,7 @@
         <w:spacing w:after="60"/>
       </w:pPr>
       <w:r>
-        <w:t xml:space="preserve">Данные валидируются Zod-схемами при загрузке модуля; сейвы версионируются и восстанавливаются после повреждений.</w:t>
+        <w:t xml:space="preserve">Данные валидируются Zod при загрузке; сейвы версионируются, повреждённые сбрасываются к дефолтам; миграции ключей — в loadRecords().</w:t>
       </w:r>
     </w:p>
     <w:p>
@@ -2072,18 +2237,18 @@
         <w:spacing w:after="60"/>
       </w:pPr>
       <w:r>
-        <w:t xml:space="preserve">Определённость где важно: доски строятся seeded-рандомом (mulberry32), порядок вопросов в категории = возрастание сложности из источника.</w:t>
+        <w:t xml:space="preserve">Доски строятся seeded-рандомом (mulberry32); порядок вопросов в категории = возрастание сложности из источника.</w:t>
       </w:r>
     </w:p>
     <w:p>
       <w:pPr>
         <w:pStyle w:val="Heading2"/>
       </w:pPr>
-      <w:bookmarkStart w:name="_Toc11" w:id="11"/>
+      <w:bookmarkStart w:name="_Toc12" w:id="12"/>
       <w:r>
         <w:t xml:space="preserve">3.2. Структура репозитория</w:t>
       </w:r>
-      <w:bookmarkEnd w:id="11"/>
+      <w:bookmarkEnd w:id="12"/>
     </w:p>
     <w:p>
       <w:pPr>
@@ -2097,7 +2262,7 @@
           <w:sz w:val="20"/>
           <w:szCs w:val="20"/>
         </w:rPr>
-        <w:t xml:space="preserve">app/src/data/     — контент: quizJson.ts (книги), uoeGames.ts, legacyBoards.ts,</w:t>
+        <w:t xml:space="preserve">app/src/data/     — контент: quizJson.ts, uoeGames.ts, legacyBoards.ts, arena3/4Boards.ts, games.ts, guides.ts</w:t>
       </w:r>
     </w:p>
     <w:p>
@@ -2112,7 +2277,7 @@
           <w:sz w:val="20"/>
           <w:szCs w:val="20"/>
         </w:rPr>
-        <w:t xml:space="preserve">                    arena3Boards.ts, arena4Boards.ts, games.ts, guides.ts, categoryTypes.ts</w:t>
+        <w:t xml:space="preserve">app/src/lib/      — движок: board.ts (доски, миксы, разбиение на части), random.ts, answerMatch.ts,</w:t>
       </w:r>
     </w:p>
     <w:p>
@@ -2127,22 +2292,7 @@
           <w:sz w:val="20"/>
           <w:szCs w:val="20"/>
         </w:rPr>
-        <w:t xml:space="preserve">app/src/lib/      — движок: board.ts (генерация досок, миксы), random.ts,</w:t>
-      </w:r>
-    </w:p>
-    <w:p>
-      <w:pPr>
-        <w:shd w:fill="F2F0E6" w:val="clear"/>
-        <w:spacing w:after="60"/>
-        <w:ind w:left="240"/>
-      </w:pPr>
-      <w:r>
-        <w:rPr>
-          <w:rFonts w:ascii="Consolas" w:cs="Consolas" w:eastAsia="Consolas" w:hAnsi="Consolas"/>
-          <w:sz w:val="20"/>
-          <w:szCs w:val="20"/>
-        </w:rPr>
-        <w:t xml:space="preserve">                    answerMatch.ts (нечёткая проверка), saves.ts (сейвы), stats.ts, schema.ts (Zod)</w:t>
+        <w:t xml:space="preserve">                    saves.ts (сейвы + миграции), stats.ts (drill list), schema.ts (Zod)</w:t>
       </w:r>
     </w:p>
     <w:p>
@@ -2187,7 +2337,7 @@
           <w:sz w:val="20"/>
           <w:szCs w:val="20"/>
         </w:rPr>
-        <w:t xml:space="preserve">app/src/components/ — BoardGrid, HostClueModal, FinalWager, WinnerScreen, Scoreboard, Toggles</w:t>
+        <w:t xml:space="preserve">app/src/components/ — BoardGrid, HostClueModal, FinalWager, WinnerScreen (+Training notes), Scoreboard</w:t>
       </w:r>
     </w:p>
     <w:p>
@@ -2202,123 +2352,7 @@
           <w:sz w:val="20"/>
           <w:szCs w:val="20"/>
         </w:rPr>
-        <w:t xml:space="preserve">app/tests/unit/   — vitest;  app/e2e/ — playwright (club, arenas, marathon, allGames)</w:t>
-      </w:r>
-    </w:p>
-    <w:p>
-      <w:pPr>
-        <w:pStyle w:val="Heading2"/>
-      </w:pPr>
-      <w:bookmarkStart w:name="_Toc12" w:id="12"/>
-      <w:r>
-        <w:t xml:space="preserve">3.3. Жизненный цикл командной игры</w:t>
-      </w:r>
-      <w:bookmarkEnd w:id="12"/>
-    </w:p>
-    <w:p>
-      <w:pPr>
-        <w:pStyle w:val="ListParagraph"/>
-        <w:numPr>
-          <w:ilvl w:val="0"/>
-          <w:numId w:val="3"/>
-        </w:numPr>
-        <w:spacing w:after="60"/>
-      </w:pPr>
-      <w:r>
-        <w:t xml:space="preserve">sets → setup (команды + переключатель финала) → board (раунд N) → clue (reveal + award) → … → last board →</w:t>
-      </w:r>
-    </w:p>
-    <w:p>
-      <w:pPr>
-        <w:pStyle w:val="ListParagraph"/>
-        <w:numPr>
-          <w:ilvl w:val="0"/>
-          <w:numId w:val="3"/>
-        </w:numPr>
-        <w:spacing w:after="60"/>
-      </w:pPr>
-      <w:r>
-        <w:t xml:space="preserve">final-wager/final-clue (если включено) → winner (таблица + Training notes).</w:t>
-      </w:r>
-    </w:p>
-    <w:p>
-      <w:pPr>
-        <w:spacing w:after="120"/>
-      </w:pPr>
-      <w:r>
-        <w:t xml:space="preserve">Микс-игры (Arena Mix) материализуются при старте: materializeGame() сэмплирует 5 досок seeded-рандомом, дальше игра идёт как обычная.</w:t>
-      </w:r>
-    </w:p>
-    <w:p>
-      <w:r>
-        <w:br w:type="page"/>
-      </w:r>
-    </w:p>
-    <w:p>
-      <w:pPr>
-        <w:pStyle w:val="Heading1"/>
-      </w:pPr>
-      <w:bookmarkStart w:name="_Toc13" w:id="13"/>
-      <w:r>
-        <w:t xml:space="preserve">4. Тестирование и качество</w:t>
-      </w:r>
-      <w:bookmarkEnd w:id="13"/>
-    </w:p>
-    <w:p>
-      <w:pPr>
-        <w:pStyle w:val="ListParagraph"/>
-        <w:numPr>
-          <w:ilvl w:val="0"/>
-          <w:numId w:val="2"/>
-        </w:numPr>
-        <w:spacing w:after="60"/>
-      </w:pPr>
-      <w:r>
-        <w:t xml:space="preserve">Юнит (47): генерация досок, валидность сетов против датасета, пулы воркбука, покрытие гайдов, матчер ответов, сейвы (включая восстановление после повреждённого JSON), статистика, анонимизация контента.</w:t>
-      </w:r>
-    </w:p>
-    <w:p>
-      <w:pPr>
-        <w:pStyle w:val="ListParagraph"/>
-        <w:numPr>
-          <w:ilvl w:val="0"/>
-          <w:numId w:val="2"/>
-        </w:numPr>
-        <w:spacing w:after="60"/>
-      </w:pPr>
-      <w:r>
-        <w:t xml:space="preserve">E2E (56): полный командный цикл, тренажёр до результатов, гайды, переключатель финальной ставки, марафон из 14 досок с точным счётом (766 500), прохождение ВСЕХ 17 игр до подиума с независимо вычисленной суммой очков — на десктопе и мобильном вьюпорте.</w:t>
-      </w:r>
-    </w:p>
-    <w:p>
-      <w:pPr>
-        <w:pStyle w:val="ListParagraph"/>
-        <w:numPr>
-          <w:ilvl w:val="0"/>
-          <w:numId w:val="2"/>
-        </w:numPr>
-        <w:spacing w:after="60"/>
-      </w:pPr>
-      <w:r>
-        <w:t xml:space="preserve">Тестовый хук: стор доступен как window.__teamStore только на localhost — продакшн его не содержит.</w:t>
-      </w:r>
-    </w:p>
-    <w:p>
-      <w:pPr>
-        <w:pStyle w:val="Heading2"/>
-      </w:pPr>
-      <w:bookmarkStart w:name="_Toc14" w:id="14"/>
-      <w:r>
-        <w:t xml:space="preserve">4.1. CI/CD</w:t>
-      </w:r>
-      <w:bookmarkEnd w:id="14"/>
-    </w:p>
-    <w:p>
-      <w:pPr>
-        <w:spacing w:after="120"/>
-      </w:pPr>
-      <w:r>
-        <w:t xml:space="preserve">Каждый пуш в main запускает: npm ci → tsc -b → vitest → playwright (desktop) → vite build → deploy-pages. Сломанный контент или регрессия правил блокируют деплой.</w:t>
+        <w:t xml:space="preserve">app/android/ · app/ios/ — нативные проекты Capacitor;  docs/STORE_GUIDE.md — публикация</w:t>
       </w:r>
     </w:p>
     <w:p>
@@ -2333,7 +2367,51 @@
           <w:sz w:val="20"/>
           <w:szCs w:val="20"/>
         </w:rPr>
-        <w:t xml:space="preserve">.github/workflows/deploy.yml — единственный пайплайн; gh-pages не используется, Pages source = GitHub Actions.</w:t>
+        <w:t xml:space="preserve">app/tests/unit/ — vitest;  app/e2e/ — playwright (club, arenas, marathon, allGames)</w:t>
+      </w:r>
+    </w:p>
+    <w:p>
+      <w:pPr>
+        <w:pStyle w:val="Heading2"/>
+      </w:pPr>
+      <w:bookmarkStart w:name="_Toc13" w:id="13"/>
+      <w:r>
+        <w:t xml:space="preserve">3.3. Жизненный цикл командной игры</w:t>
+      </w:r>
+      <w:bookmarkEnd w:id="13"/>
+    </w:p>
+    <w:p>
+      <w:pPr>
+        <w:pStyle w:val="ListParagraph"/>
+        <w:numPr>
+          <w:ilvl w:val="0"/>
+          <w:numId w:val="3"/>
+        </w:numPr>
+        <w:spacing w:after="60"/>
+      </w:pPr>
+      <w:r>
+        <w:t xml:space="preserve">sets → setup (команды + переключатель финала) → board → clue (reveal + award) → … → last board →</w:t>
+      </w:r>
+    </w:p>
+    <w:p>
+      <w:pPr>
+        <w:pStyle w:val="ListParagraph"/>
+        <w:numPr>
+          <w:ilvl w:val="0"/>
+          <w:numId w:val="3"/>
+        </w:numPr>
+        <w:spacing w:after="60"/>
+      </w:pPr>
+      <w:r>
+        <w:t xml:space="preserve">final (если включён) → winner (таблица + Training notes). В любой точке доски: «Завершить игру» → к финалу или сразу к итогам.</w:t>
+      </w:r>
+    </w:p>
+    <w:p>
+      <w:pPr>
+        <w:spacing w:after="120"/>
+      </w:pPr>
+      <w:r>
+        <w:t xml:space="preserve">Длинные игры автоматически делятся на части ≤ 3 досок (splitGameIntoParts); Arena Mix материализует 3 случайные доски при старте (materializeGame).</w:t>
       </w:r>
     </w:p>
     <w:p>
@@ -2345,21 +2423,108 @@
       <w:pPr>
         <w:pStyle w:val="Heading1"/>
       </w:pPr>
+      <w:bookmarkStart w:name="_Toc14" w:id="14"/>
+      <w:r>
+        <w:t xml:space="preserve">4. Тестирование и качество</w:t>
+      </w:r>
+      <w:bookmarkEnd w:id="14"/>
+    </w:p>
+    <w:p>
+      <w:pPr>
+        <w:pStyle w:val="ListParagraph"/>
+        <w:numPr>
+          <w:ilvl w:val="0"/>
+          <w:numId w:val="2"/>
+        </w:numPr>
+        <w:spacing w:after="60"/>
+      </w:pPr>
+      <w:r>
+        <w:t xml:space="preserve">Юнит (53): доски, разбиение на части (без потерь и дублей, мультиплаеры 1–3), валидность сетов, пулы воркбука, матчер, сейвы и миграции, статистика, анонимизация.</w:t>
+      </w:r>
+    </w:p>
+    <w:p>
+      <w:pPr>
+        <w:pStyle w:val="ListParagraph"/>
+        <w:numPr>
+          <w:ilvl w:val="0"/>
+          <w:numId w:val="2"/>
+        </w:numPr>
+        <w:spacing w:after="60"/>
+      </w:pPr>
+      <w:r>
+        <w:t xml:space="preserve">E2E (88): командный цикл, тренажёр (включая длину 5/10/20 и сохранение выбора), гайды, переключатель финала, досрочное завершение (отмена/к итогам/к финалу), марафон части 1 с точным счётом 45 000, прохождение всех 26 частей до подиума с независимо вычисленной суммой — на десктопе и мобильном.</w:t>
+      </w:r>
+    </w:p>
+    <w:p>
+      <w:pPr>
+        <w:pStyle w:val="ListParagraph"/>
+        <w:numPr>
+          <w:ilvl w:val="0"/>
+          <w:numId w:val="2"/>
+        </w:numPr>
+        <w:spacing w:after="60"/>
+      </w:pPr>
+      <w:r>
+        <w:t xml:space="preserve">Тестовый хук: window.__teamStore доступен только на localhost; в проде его нет.</w:t>
+      </w:r>
+    </w:p>
+    <w:p>
+      <w:pPr>
+        <w:pStyle w:val="Heading2"/>
+      </w:pPr>
       <w:bookmarkStart w:name="_Toc15" w:id="15"/>
       <w:r>
+        <w:t xml:space="preserve">4.1. CI/CD</w:t>
+      </w:r>
+      <w:bookmarkEnd w:id="15"/>
+    </w:p>
+    <w:p>
+      <w:pPr>
+        <w:spacing w:after="120"/>
+      </w:pPr>
+      <w:r>
+        <w:t xml:space="preserve">Пуш в main: npm ci → tsc → vitest → playwright (десктоп-гейт) → vite build → deploy-pages. Отдельно: android.yml (APK+AAB артефакты) и ios.yml (проверка сборки на macos-latest). Регрессия правил или контента блокирует деплой.</w:t>
+      </w:r>
+    </w:p>
+    <w:p>
+      <w:pPr>
+        <w:shd w:fill="F2F0E6" w:val="clear"/>
+        <w:spacing w:after="60"/>
+        <w:ind w:left="240"/>
+      </w:pPr>
+      <w:r>
+        <w:rPr>
+          <w:rFonts w:ascii="Consolas" w:cs="Consolas" w:eastAsia="Consolas" w:hAnsi="Consolas"/>
+          <w:sz w:val="20"/>
+          <w:szCs w:val="20"/>
+        </w:rPr>
+        <w:t xml:space="preserve">.github/workflows/: deploy.yml (Pages+e2e), android.yml, ios.yml</w:t>
+      </w:r>
+    </w:p>
+    <w:p>
+      <w:r>
+        <w:br w:type="page"/>
+      </w:r>
+    </w:p>
+    <w:p>
+      <w:pPr>
+        <w:pStyle w:val="Heading1"/>
+      </w:pPr>
+      <w:bookmarkStart w:name="_Toc16" w:id="16"/>
+      <w:r>
         <w:t xml:space="preserve">5. Как добавлять фичи (руководство разработчика)</w:t>
       </w:r>
-      <w:bookmarkEnd w:id="15"/>
+      <w:bookmarkEnd w:id="16"/>
     </w:p>
     <w:p>
       <w:pPr>
         <w:pStyle w:val="Heading2"/>
       </w:pPr>
-      <w:bookmarkStart w:name="_Toc16" w:id="16"/>
+      <w:bookmarkStart w:name="_Toc17" w:id="17"/>
       <w:r>
         <w:t xml:space="preserve">5.1. Новая игра из существующих досок</w:t>
       </w:r>
-      <w:bookmarkEnd w:id="16"/>
+      <w:bookmarkEnd w:id="17"/>
     </w:p>
     <w:p>
       <w:pPr>
@@ -2371,7 +2536,7 @@
         <w:spacing w:after="60"/>
       </w:pPr>
       <w:r>
-        <w:t xml:space="preserve">Откройте app/src/data/games.ts и добавьте запись GameDef: id, name, emoji, blurb, level, bookRounds (категории из quizJson по имени) и/или boardRounds (id досок из uoeGames/legacyBoards/arena*), final, series.</w:t>
+        <w:t xml:space="preserve">Добавьте запись GameDef в app/src/data/games.ts (bookRounds по именам категорий и/или boardRounds по id досок).</w:t>
       </w:r>
     </w:p>
     <w:p>
@@ -2384,7 +2549,7 @@
         <w:spacing w:after="60"/>
       </w:pPr>
       <w:r>
-        <w:t xml:space="preserve">Запустите npm test — тесты проверят ссылки на категории/доски, полноту 5×5 и отсутствие повторов категорий внутри игры.</w:t>
+        <w:t xml:space="preserve">Длиннее 3 досок — разбиение на части произойдёт автоматически, ничего дополнительно не нужно.</w:t>
       </w:r>
     </w:p>
     <w:p>
@@ -2397,18 +2562,18 @@
         <w:spacing w:after="60"/>
       </w:pPr>
       <w:r>
-        <w:t xml:space="preserve">E2E-прогон всех игр (allGames.spec.ts) подхватит новую игру автоматически.</w:t>
+        <w:t xml:space="preserve">npm test проверит ссылки, полноту 5×5 и дубли; allGames.spec.ts подхватит игру в e2e автоматически.</w:t>
       </w:r>
     </w:p>
     <w:p>
       <w:pPr>
         <w:pStyle w:val="Heading2"/>
       </w:pPr>
-      <w:bookmarkStart w:name="_Toc17" w:id="17"/>
+      <w:bookmarkStart w:name="_Toc18" w:id="18"/>
       <w:r>
         <w:t xml:space="preserve">5.2. Новый контент (доска/категории)</w:t>
       </w:r>
-      <w:bookmarkEnd w:id="17"/>
+      <w:bookmarkEnd w:id="18"/>
     </w:p>
     <w:p>
       <w:pPr>
@@ -2420,7 +2585,7 @@
         <w:spacing w:after="60"/>
       </w:pPr>
       <w:r>
-        <w:t xml:space="preserve">Сформируйте массив BoardGame: { id, title, categories: [{ name, clues: [{ clue, answer, note? }] }] } — по 5 вопросов на категорию.</w:t>
+        <w:t xml:space="preserve">Массив BoardGame: { id, title, categories: [{ name, clues: [{ clue, answer, note? }] }] } — 5 вопросов на категорию.</w:t>
       </w:r>
     </w:p>
     <w:p>
@@ -2433,7 +2598,7 @@
         <w:spacing w:after="60"/>
       </w:pPr>
       <w:r>
-        <w:t xml:space="preserve">Положите в app/src/data/ (по образцу arena4Boards.ts) и зарегистрируйте в ALL_BOARDS в app/src/lib/board.ts.</w:t>
+        <w:t xml:space="preserve">Зарегистрируйте в ALL_BOARDS в app/src/lib/board.ts; проверьте пересечения вопросов с существующими аренами.</w:t>
       </w:r>
     </w:p>
     <w:p>
@@ -2446,18 +2611,18 @@
         <w:spacing w:after="60"/>
       </w:pPr>
       <w:r>
-        <w:t xml:space="preserve">Проверьте пересечения вопросов с существующими аренами (скрипт-анализ на основе нормализованного текста вопроса).</w:t>
+        <w:t xml:space="preserve">Для мобильных артефактов после правок: npm run sync; сборка нативных проектов — в CI.</w:t>
       </w:r>
     </w:p>
     <w:p>
       <w:pPr>
         <w:pStyle w:val="Heading2"/>
       </w:pPr>
-      <w:bookmarkStart w:name="_Toc18" w:id="18"/>
+      <w:bookmarkStart w:name="_Toc19" w:id="19"/>
       <w:r>
         <w:t xml:space="preserve">5.3. Новый тип задания для воркбука</w:t>
       </w:r>
-      <w:bookmarkEnd w:id="18"/>
+      <w:bookmarkEnd w:id="19"/>
     </w:p>
     <w:p>
       <w:pPr>
@@ -2469,7 +2634,7 @@
         <w:spacing w:after="60"/>
       </w:pPr>
       <w:r>
-        <w:t xml:space="preserve">Добавьте тип в TaskType + TASK_TYPE_LABELS (categoryTypes.ts) и разметьте категории в CATEGORY_TYPES.</w:t>
+        <w:t xml:space="preserve">TaskType + TASK_TYPE_LABELS (categoryTypes.ts), разметка CATEGORY_TYPES; гайд в guides.ts с тем же type.</w:t>
       </w:r>
     </w:p>
     <w:p>
@@ -2482,18 +2647,18 @@
         <w:spacing w:after="60"/>
       </w:pPr>
       <w:r>
-        <w:t xml:space="preserve">Добавьте гайд в guides.ts (type должен совпадать) — тест «есть гайд для каждого типа» это проверит.</w:t>
+        <w:t xml:space="preserve">Тесты покрытия типов и пулов — в tests/unit/workbook.test.ts.</w:t>
       </w:r>
     </w:p>
     <w:p>
       <w:pPr>
         <w:pStyle w:val="Heading2"/>
       </w:pPr>
-      <w:bookmarkStart w:name="_Toc19" w:id="19"/>
-      <w:r>
-        <w:t xml:space="preserve">5.4. Новая фича в игровом движке</w:t>
-      </w:r>
-      <w:bookmarkEnd w:id="19"/>
+      <w:bookmarkStart w:name="_Toc20" w:id="20"/>
+      <w:r>
+        <w:t xml:space="preserve">5.4. Новая механика движка</w:t>
+      </w:r>
+      <w:bookmarkEnd w:id="20"/>
     </w:p>
     <w:p>
       <w:pPr>
@@ -2505,7 +2670,7 @@
         <w:spacing w:after="60"/>
       </w:pPr>
       <w:r>
-        <w:t xml:space="preserve">Логику добавляйте в store (действия) или lib (чистые функции) — не в компоненты.</w:t>
+        <w:t xml:space="preserve">Логика — в store (действия) или lib (чистые функции), не в компонентах.</w:t>
       </w:r>
     </w:p>
     <w:p>
@@ -2518,31 +2683,18 @@
         <w:spacing w:after="60"/>
       </w:pPr>
       <w:r>
-        <w:t xml:space="preserve">Сначала юнит-тест в tests/unit/, затем e2e-сценарий в e2e/ (для полного цикла есть хук window.__teamStore).</w:t>
-      </w:r>
-    </w:p>
-    <w:p>
-      <w:pPr>
-        <w:pStyle w:val="ListParagraph"/>
-        <w:numPr>
-          <w:ilvl w:val="0"/>
-          <w:numId w:val="3"/>
-        </w:numPr>
-        <w:spacing w:after="60"/>
-      </w:pPr>
-      <w:r>
-        <w:t xml:space="preserve">Проверьте npm test &amp;&amp; npx playwright test локально; CI повторит это на пуше.</w:t>
+        <w:t xml:space="preserve">Сначала юнит-тест, затем e2e; CI повторит оба на пуше (деплой блокируется при падении).</w:t>
       </w:r>
     </w:p>
     <w:p>
       <w:pPr>
         <w:pStyle w:val="Heading2"/>
       </w:pPr>
-      <w:bookmarkStart w:name="_Toc20" w:id="20"/>
-      <w:r>
-        <w:t xml:space="preserve">5.5. Правила оформления кода</w:t>
-      </w:r>
-      <w:bookmarkEnd w:id="20"/>
+      <w:bookmarkStart w:name="_Toc21" w:id="21"/>
+      <w:r>
+        <w:t xml:space="preserve">5.5. Правила кода</w:t>
+      </w:r>
+      <w:bookmarkEnd w:id="21"/>
     </w:p>
     <w:p>
       <w:pPr>
@@ -2554,7 +2706,7 @@
         <w:spacing w:after="60"/>
       </w:pPr>
       <w:r>
-        <w:t xml:space="preserve">TypeScript strict, verbatimModuleSyntax: типы импортируются через import type.</w:t>
+        <w:t xml:space="preserve">TypeScript strict + verbatimModuleSyntax (import type для типов).</w:t>
       </w:r>
     </w:p>
     <w:p>
@@ -2567,7 +2719,7 @@
         <w:spacing w:after="60"/>
       </w:pPr>
       <w:r>
-        <w:t xml:space="preserve">Цвета только из темы (src/index.css, палитра sage/butter/cream) — не хардкодить hex в компонентах, кроме командных цветов.</w:t>
+        <w:t xml:space="preserve">Цвета — только из темы (src/index.css); новые окна активностей — левое позиционирование на lg по образцу HostClueModal.</w:t>
       </w:r>
     </w:p>
     <w:p>
@@ -2580,7 +2732,7 @@
         <w:spacing w:after="60"/>
       </w:pPr>
       <w:r>
-        <w:t xml:space="preserve">Анимации — через motion/react; уважать useMotionSafe() (reduced motion).</w:t>
+        <w:t xml:space="preserve">Анимации — motion/react; всегда учитывать useMotionSafe().</w:t>
       </w:r>
     </w:p>
     <w:p>
@@ -2592,18 +2744,18 @@
       <w:pPr>
         <w:pStyle w:val="Heading1"/>
       </w:pPr>
-      <w:bookmarkStart w:name="_Toc21" w:id="21"/>
+      <w:bookmarkStart w:name="_Toc22" w:id="22"/>
       <w:r>
         <w:t xml:space="preserve">6. Шаблон постановки будущей фичи</w:t>
       </w:r>
-      <w:bookmarkEnd w:id="21"/>
+      <w:bookmarkEnd w:id="22"/>
     </w:p>
     <w:p>
       <w:pPr>
         <w:spacing w:after="120"/>
       </w:pPr>
       <w:r>
-        <w:t xml:space="preserve">Для каждой новой задачи заполняйте карточку:</w:t>
+        <w:t xml:space="preserve">Для каждой новой задачи заполняйте карточку (так написаны ТЗ 1–3 этой версии):</w:t>
       </w:r>
     </w:p>
     <w:tbl>
@@ -3061,11 +3213,11 @@
       <w:pPr>
         <w:pStyle w:val="Heading1"/>
       </w:pPr>
-      <w:bookmarkStart w:name="_Toc22" w:id="22"/>
-      <w:r>
-        <w:t xml:space="preserve">7. Открытые направления (бэклог-идеи)</w:t>
-      </w:r>
-      <w:bookmarkEnd w:id="22"/>
+      <w:bookmarkStart w:name="_Toc23" w:id="23"/>
+      <w:r>
+        <w:t xml:space="preserve">7. Открытые направления (бэклог)</w:t>
+      </w:r>
+      <w:bookmarkEnd w:id="23"/>
     </w:p>
     <w:p>
       <w:pPr>
@@ -3077,7 +3229,7 @@
         <w:spacing w:after="60"/>
       </w:pPr>
       <w:r>
-        <w:t xml:space="preserve">Кнопка «Practice these» из drill list → тест в воркбуке по проваленным категориям.</w:t>
+        <w:t xml:space="preserve">Кнопка «Practice these» из drill list → тест по проваленным категориям.</w:t>
       </w:r>
     </w:p>
     <w:p>
@@ -3090,57 +3242,57 @@
         <w:spacing w:after="60"/>
       </w:pPr>
       <w:r>
+        <w:t xml:space="preserve">Подписанный релизный AAB через секреты репозитория; TestFlight-архив для iOS из CI.</w:t>
+      </w:r>
+    </w:p>
+    <w:p>
+      <w:pPr>
+        <w:pStyle w:val="ListParagraph"/>
+        <w:numPr>
+          <w:ilvl w:val="0"/>
+          <w:numId w:val="2"/>
+        </w:numPr>
+        <w:spacing w:after="60"/>
+      </w:pPr>
+      <w:r>
+        <w:t xml:space="preserve">Экспорт/импорт статистики (JSON) между устройствами.</w:t>
+      </w:r>
+    </w:p>
+    <w:p>
+      <w:pPr>
+        <w:pStyle w:val="ListParagraph"/>
+        <w:numPr>
+          <w:ilvl w:val="0"/>
+          <w:numId w:val="2"/>
+        </w:numPr>
+        <w:spacing w:after="60"/>
+      </w:pPr>
+      <w:r>
+        <w:t xml:space="preserve">Печатные карточки для офлайн-игры (генерация PDF из досок).</w:t>
+      </w:r>
+    </w:p>
+    <w:p>
+      <w:pPr>
+        <w:pStyle w:val="ListParagraph"/>
+        <w:numPr>
+          <w:ilvl w:val="0"/>
+          <w:numId w:val="2"/>
+        </w:numPr>
+        <w:spacing w:after="60"/>
+      </w:pPr>
+      <w:r>
         <w:t xml:space="preserve">Таймер на ответ в командном режиме (опционально).</w:t>
       </w:r>
     </w:p>
     <w:p>
       <w:pPr>
-        <w:pStyle w:val="ListParagraph"/>
-        <w:numPr>
-          <w:ilvl w:val="0"/>
-          <w:numId w:val="2"/>
-        </w:numPr>
-        <w:spacing w:after="60"/>
-      </w:pPr>
-      <w:r>
-        <w:t xml:space="preserve">Экспорт/импорт статистики (JSON) для переноса между устройствами.</w:t>
-      </w:r>
-    </w:p>
-    <w:p>
-      <w:pPr>
-        <w:pStyle w:val="ListParagraph"/>
-        <w:numPr>
-          <w:ilvl w:val="0"/>
-          <w:numId w:val="2"/>
-        </w:numPr>
-        <w:spacing w:after="60"/>
-      </w:pPr>
-      <w:r>
-        <w:t xml:space="preserve">Печатные карточки для офлайн-игры (генерация PDF из досок).</w:t>
-      </w:r>
-    </w:p>
-    <w:p>
-      <w:pPr>
-        <w:pStyle w:val="ListParagraph"/>
-        <w:numPr>
-          <w:ilvl w:val="0"/>
-          <w:numId w:val="2"/>
-        </w:numPr>
-        <w:spacing w:after="60"/>
-      </w:pPr>
-      <w:r>
-        <w:t xml:space="preserve">Новые арены из дополнительных источников заданий.</w:t>
-      </w:r>
-    </w:p>
-    <w:p>
-      <w:pPr>
         <w:pStyle w:val="Heading1"/>
       </w:pPr>
-      <w:bookmarkStart w:name="_Toc23" w:id="23"/>
+      <w:bookmarkStart w:name="_Toc24" w:id="24"/>
       <w:r>
         <w:t xml:space="preserve">8. Глоссарий</w:t>
       </w:r>
-      <w:bookmarkEnd w:id="23"/>
+      <w:bookmarkEnd w:id="24"/>
     </w:p>
     <w:tbl>
       <w:tblPr>
@@ -3291,7 +3443,7 @@
                 <w:b w:val="false"/>
                 <w:bCs w:val="false"/>
               </w:rPr>
-              <w:t xml:space="preserve">Сет / игра (game)</w:t>
+              <w:t xml:space="preserve">Часть (part)</w:t>
             </w:r>
           </w:p>
         </w:tc>
@@ -3317,7 +3469,7 @@
                 <w:b w:val="false"/>
                 <w:bCs w:val="false"/>
               </w:rPr>
-              <w:t xml:space="preserve">Несколько досок подряд + опциональный финал со ставкой</w:t>
+              <w:t xml:space="preserve">Игра после разбиения: ≤ 3 досок; ценности заново от 100–500</w:t>
             </w:r>
           </w:p>
         </w:tc>
@@ -3425,7 +3577,7 @@
                 <w:b w:val="false"/>
                 <w:bCs w:val="false"/>
               </w:rPr>
-              <w:t xml:space="preserve">Плитка, которую не ответила ни одна команда (сигнал для drill list)</w:t>
+              <w:t xml:space="preserve">Плитка без ответа — сигнал для drill list</w:t>
             </w:r>
           </w:p>
         </w:tc>
@@ -3479,7 +3631,7 @@
                 <w:b w:val="false"/>
                 <w:bCs w:val="false"/>
               </w:rPr>
-              <w:t xml:space="preserve">Список категорий с наибольшим числом промахов</w:t>
+              <w:t xml:space="preserve">Категории с наибольшим числом промахов (игра и all-time)</w:t>
             </w:r>
           </w:p>
         </w:tc>
@@ -3533,7 +3685,61 @@
                 <w:b w:val="false"/>
                 <w:bCs w:val="false"/>
               </w:rPr>
-              <w:t xml:space="preserve">Превращение микс-игры в конкретный набор досок при старте</w:t>
+              <w:t xml:space="preserve">Сэмплирование досок микс-игры при старте</w:t>
+            </w:r>
+          </w:p>
+        </w:tc>
+      </w:tr>
+      <w:tr>
+        <w:tc>
+          <w:tcPr>
+            <w:tcW w:type="dxa" w:w="3000"/>
+            <w:tcBorders>
+              <w:top w:val="single" w:color="C9CFC9" w:sz="1"/>
+              <w:left w:val="single" w:color="C9CFC9" w:sz="1"/>
+              <w:bottom w:val="single" w:color="C9CFC9" w:sz="1"/>
+              <w:right w:val="single" w:color="C9CFC9" w:sz="1"/>
+            </w:tcBorders>
+            <w:tcMar>
+              <w:top w:type="dxa" w:w="80"/>
+              <w:left w:type="dxa" w:w="120"/>
+              <w:bottom w:type="dxa" w:w="80"/>
+              <w:right w:type="dxa" w:w="120"/>
+            </w:tcMar>
+          </w:tcPr>
+          <w:p>
+            <w:r>
+              <w:rPr>
+                <w:b w:val="false"/>
+                <w:bCs w:val="false"/>
+              </w:rPr>
+              <w:t xml:space="preserve">Capacitor</w:t>
+            </w:r>
+          </w:p>
+        </w:tc>
+        <w:tc>
+          <w:tcPr>
+            <w:tcW w:type="dxa" w:w="6026"/>
+            <w:tcBorders>
+              <w:top w:val="single" w:color="C9CFC9" w:sz="1"/>
+              <w:left w:val="single" w:color="C9CFC9" w:sz="1"/>
+              <w:bottom w:val="single" w:color="C9CFC9" w:sz="1"/>
+              <w:right w:val="single" w:color="C9CFC9" w:sz="1"/>
+            </w:tcBorders>
+            <w:tcMar>
+              <w:top w:type="dxa" w:w="80"/>
+              <w:left w:type="dxa" w:w="120"/>
+              <w:bottom w:type="dxa" w:w="80"/>
+              <w:right w:type="dxa" w:w="120"/>
+            </w:tcMar>
+          </w:tcPr>
+          <w:p>
+            <w:r>
+              <w:rPr>
+                <w:b w:val="false"/>
+                <w:bCs w:val="false"/>
+              </w:rPr>
+              <w:t xml:space="preserve">Нативная оболочка над веб-приложением (Android/iOS)</w:t>
             </w:r>
           </w:p>
         </w:tc>
@@ -3562,7 +3768,7 @@
           <w:iCs/>
           <w:color w:val="7A857D"/>
         </w:rPr>
-        <w:t xml:space="preserve">Конец документа. Шаблон расширяется по мере роста проекта: новые разделы добавляются после раздела 6, версии документа нумеруются.</w:t>
+        <w:t xml:space="preserve">Конец документа. Шаблон расширяется: новые разделы добавляются после раздела 6; версии нумеруются.</w:t>
       </w:r>
     </w:p>
     <w:sectPr>

</xml_diff>